<commit_message>
Trabajando en un método de extracción de características + clustering (K-means).
</commit_message>
<xml_diff>
--- a/temp/Explorando_algoritmos_de_clasificacion/Una_primera_aproximacion_al_descubrimiento_de_patrones_en_VALLAS.docx
+++ b/temp/Explorando_algoritmos_de_clasificacion/Una_primera_aproximacion_al_descubrimiento_de_patrones_en_VALLAS.docx
@@ -537,6 +537,212 @@
             </a:graphic>
           </wp:inline>
         </w:drawing>
+      </w:r>
+    </w:p>
+    <w:p>
+      <w:pPr>
+        <w:jc w:val="both"/>
+        <w:rPr>
+          <w:rFonts w:ascii="Book Antiqua" w:hAnsi="Book Antiqua"/>
+        </w:rPr>
+      </w:pPr>
+      <w:r>
+        <w:rPr>
+          <w:rFonts w:ascii="Book Antiqua" w:hAnsi="Book Antiqua"/>
+          <w:i/>
+          <w:iCs/>
+        </w:rPr>
+        <w:lastRenderedPageBreak/>
+        <w:t>¿Qué ocurriría con otras soluciones clásicas más sencillas?</w:t>
+      </w:r>
+      <w:r>
+        <w:rPr>
+          <w:rFonts w:ascii="Book Antiqua" w:hAnsi="Book Antiqua"/>
+        </w:rPr>
+        <w:t xml:space="preserve"> Por ejemplo, vamos a implementar una etapa de extracción de características clásica seguida de un algoritmo de </w:t>
+      </w:r>
+      <w:proofErr w:type="spellStart"/>
+      <w:r>
+        <w:rPr>
+          <w:rFonts w:ascii="Book Antiqua" w:hAnsi="Book Antiqua"/>
+        </w:rPr>
+        <w:t>clustering</w:t>
+      </w:r>
+      <w:proofErr w:type="spellEnd"/>
+      <w:r>
+        <w:rPr>
+          <w:rFonts w:ascii="Book Antiqua" w:hAnsi="Book Antiqua"/>
+        </w:rPr>
+        <w:t xml:space="preserve"> (K-</w:t>
+      </w:r>
+      <w:proofErr w:type="spellStart"/>
+      <w:r>
+        <w:rPr>
+          <w:rFonts w:ascii="Book Antiqua" w:hAnsi="Book Antiqua"/>
+        </w:rPr>
+        <w:t>means</w:t>
+      </w:r>
+      <w:proofErr w:type="spellEnd"/>
+      <w:r>
+        <w:rPr>
+          <w:rFonts w:ascii="Book Antiqua" w:hAnsi="Book Antiqua"/>
+        </w:rPr>
+        <w:t>).</w:t>
+      </w:r>
+    </w:p>
+    <w:p>
+      <w:pPr>
+        <w:jc w:val="center"/>
+        <w:rPr>
+          <w:rFonts w:ascii="Book Antiqua" w:hAnsi="Book Antiqua"/>
+        </w:rPr>
+      </w:pPr>
+      <w:r>
+        <w:rPr>
+          <w:rFonts w:ascii="Book Antiqua" w:hAnsi="Book Antiqua"/>
+        </w:rPr>
+        <w:drawing>
+          <wp:inline distT="0" distB="0" distL="0" distR="0" wp14:anchorId="1034C37F" wp14:editId="66C37BE3">
+            <wp:extent cx="8269356" cy="5270500"/>
+            <wp:effectExtent l="0" t="0" r="0" b="0"/>
+            <wp:docPr id="1093477075" name="Imagen 1"/>
+            <wp:cNvGraphicFramePr>
+              <a:graphicFrameLocks xmlns:a="http://schemas.openxmlformats.org/drawingml/2006/main" noChangeAspect="1"/>
+            </wp:cNvGraphicFramePr>
+            <a:graphic xmlns:a="http://schemas.openxmlformats.org/drawingml/2006/main">
+              <a:graphicData uri="http://schemas.openxmlformats.org/drawingml/2006/picture">
+                <pic:pic xmlns:pic="http://schemas.openxmlformats.org/drawingml/2006/picture">
+                  <pic:nvPicPr>
+                    <pic:cNvPr id="1093477075" name=""/>
+                    <pic:cNvPicPr/>
+                  </pic:nvPicPr>
+                  <pic:blipFill rotWithShape="1">
+                    <a:blip r:embed="rId8"/>
+                    <a:srcRect r="7772"/>
+                    <a:stretch>
+                      <a:fillRect/>
+                    </a:stretch>
+                  </pic:blipFill>
+                  <pic:spPr bwMode="auto">
+                    <a:xfrm>
+                      <a:off x="0" y="0"/>
+                      <a:ext cx="8269356" cy="5270500"/>
+                    </a:xfrm>
+                    <a:prstGeom prst="rect">
+                      <a:avLst/>
+                    </a:prstGeom>
+                    <a:ln>
+                      <a:noFill/>
+                    </a:ln>
+                    <a:extLst>
+                      <a:ext uri="{53640926-AAD7-44D8-BBD7-CCE9431645EC}">
+                        <a14:shadowObscured xmlns:a14="http://schemas.microsoft.com/office/drawing/2010/main"/>
+                      </a:ext>
+                    </a:extLst>
+                  </pic:spPr>
+                </pic:pic>
+              </a:graphicData>
+            </a:graphic>
+          </wp:inline>
+        </w:drawing>
+      </w:r>
+    </w:p>
+    <w:p>
+      <w:pPr>
+        <w:jc w:val="both"/>
+        <w:rPr>
+          <w:rFonts w:ascii="Book Antiqua" w:hAnsi="Book Antiqua"/>
+        </w:rPr>
+      </w:pPr>
+      <w:r>
+        <w:rPr>
+          <w:rFonts w:ascii="Book Antiqua" w:hAnsi="Book Antiqua"/>
+        </w:rPr>
+        <w:t xml:space="preserve">Hemos calculado </w:t>
+      </w:r>
+      <w:proofErr w:type="spellStart"/>
+      <w:r>
+        <w:rPr>
+          <w:rFonts w:ascii="Book Antiqua" w:hAnsi="Book Antiqua"/>
+          <w:b/>
+          <w:bCs/>
+        </w:rPr>
+        <w:t>features</w:t>
+      </w:r>
+      <w:proofErr w:type="spellEnd"/>
+      <w:r>
+        <w:rPr>
+          <w:rFonts w:ascii="Book Antiqua" w:hAnsi="Book Antiqua"/>
+          <w:b/>
+          <w:bCs/>
+        </w:rPr>
+        <w:t xml:space="preserve"> temporales, FFT, entropía y módulo del vector de aceleración/giro</w:t>
+      </w:r>
+      <w:r>
+        <w:rPr>
+          <w:rFonts w:ascii="Book Antiqua" w:hAnsi="Book Antiqua"/>
+        </w:rPr>
+        <w:t>.</w:t>
+      </w:r>
+      <w:r>
+        <w:rPr>
+          <w:rFonts w:ascii="Book Antiqua" w:hAnsi="Book Antiqua"/>
+        </w:rPr>
+        <w:t xml:space="preserve"> Observamos una segmentación</w:t>
+      </w:r>
+      <w:r>
+        <w:rPr>
+          <w:rFonts w:ascii="Book Antiqua" w:hAnsi="Book Antiqua"/>
+        </w:rPr>
+        <w:t xml:space="preserve"> </w:t>
+      </w:r>
+      <w:r>
+        <w:rPr>
+          <w:rFonts w:ascii="Book Antiqua" w:hAnsi="Book Antiqua"/>
+          <w:i/>
+          <w:iCs/>
+        </w:rPr>
+        <w:t>coherente</w:t>
+      </w:r>
+      <w:r>
+        <w:rPr>
+          <w:rFonts w:ascii="Book Antiqua" w:hAnsi="Book Antiqua"/>
+        </w:rPr>
+        <w:t xml:space="preserve"> de las señales de </w:t>
+      </w:r>
+      <w:proofErr w:type="spellStart"/>
+      <w:r>
+        <w:rPr>
+          <w:rFonts w:ascii="Book Antiqua" w:hAnsi="Book Antiqua"/>
+        </w:rPr>
+        <w:t>imumetría</w:t>
+      </w:r>
+      <w:proofErr w:type="spellEnd"/>
+      <w:r>
+        <w:rPr>
+          <w:rFonts w:ascii="Book Antiqua" w:hAnsi="Book Antiqua"/>
+        </w:rPr>
+        <w:t>.</w:t>
+      </w:r>
+      <w:r>
+        <w:rPr>
+          <w:rFonts w:ascii="Book Antiqua" w:hAnsi="Book Antiqua"/>
+        </w:rPr>
+        <w:t xml:space="preserve"> Interesantes resultados, seguimos explorando otros algoritmos/</w:t>
+      </w:r>
+      <w:proofErr w:type="spellStart"/>
+      <w:r>
+        <w:rPr>
+          <w:rFonts w:ascii="Book Antiqua" w:hAnsi="Book Antiqua"/>
+        </w:rPr>
+        <w:t>datasets</w:t>
+      </w:r>
+      <w:proofErr w:type="spellEnd"/>
+      <w:r>
+        <w:rPr>
+          <w:rFonts w:ascii="Book Antiqua" w:hAnsi="Book Antiqua"/>
+        </w:rPr>
+        <w:t>.</w:t>
       </w:r>
     </w:p>
     <w:sectPr>

</xml_diff>